<commit_message>
the cover letter, TRIPOD+AI checklist and section parts follow the senior author's 2026-09-21 revision: the letter carries the new title and current numbers, the checklist points at current sections, supplement numbering and references, and parts/ is re-split into 15 manuscript and 27 supplement sections, with a PDF for each manuscript section so it can be read on the board alone
</commit_message>
<xml_diff>
--- a/research/TRD-EHR/paper1-trd-prediction/cover_letter.docx
+++ b/research/TRD-EHR/paper1-trd-prediction/cover_letter.docx
@@ -7,7 +7,7 @@
         <w:pStyle w:val="FirstParagraph"/>
       </w:pPr>
       <w:r>
-        <w:t xml:space="preserve">30 August 2026</w:t>
+        <w:t xml:space="preserve">28 September 2026</w:t>
       </w:r>
     </w:p>
     <w:p>
@@ -54,7 +54,7 @@
           <w:bCs/>
           <w:b/>
         </w:rPr>
-        <w:t xml:space="preserve">Typed Feature Vectors, Generalized Pretrained Transformer Embeddings of</w:t>
+        <w:t xml:space="preserve">Feature Vectors and Narrative Embeddings for Predicting a Treatment</w:t>
       </w:r>
       <w:r>
         <w:rPr>
@@ -68,7 +68,7 @@
           <w:bCs/>
           <w:b/>
         </w:rPr>
-        <w:t xml:space="preserve">Deterministic Patient Narratives, and Nearest-Neighbor Retrieval for Predicting</w:t>
+        <w:t xml:space="preserve">Switching Proxy for Treatment Resistant Depression: Retrospective Cohort</w:t>
       </w:r>
       <w:r>
         <w:rPr>
@@ -82,21 +82,7 @@
           <w:bCs/>
           <w:b/>
         </w:rPr>
-        <w:t xml:space="preserve">a Treatment-Switch–Defined Electronic Health Record Proxy for Treatment-</w:t>
-      </w:r>
-      <w:r>
-        <w:rPr>
-          <w:bCs/>
-          <w:b/>
-        </w:rPr>
-        <w:t xml:space="preserve"> </w:t>
-      </w:r>
-      <w:r>
-        <w:rPr>
-          <w:bCs/>
-          <w:b/>
-        </w:rPr>
-        <w:t xml:space="preserve">Resistant Depression: Retrospective Cohort Study,</w:t>
+        <w:t xml:space="preserve">Study,</w:t>
       </w:r>
       <w:r>
         <w:rPr>
@@ -109,13 +95,7 @@
         <w:t xml:space="preserve"> </w:t>
       </w:r>
       <w:r>
-        <w:t xml:space="preserve">for</w:t>
-      </w:r>
-      <w:r>
-        <w:t xml:space="preserve"> </w:t>
-      </w:r>
-      <w:r>
-        <w:t xml:space="preserve">consideration in</w:t>
+        <w:t xml:space="preserve">for consideration in</w:t>
       </w:r>
       <w:r>
         <w:t xml:space="preserve"> </w:t>
@@ -136,25 +116,31 @@
         <w:pStyle w:val="BodyText"/>
       </w:pPr>
       <w:r>
-        <w:t xml:space="preserve">This study asks whether routinely collected electronic health record</w:t>
-      </w:r>
-      <w:r>
-        <w:t xml:space="preserve"> </w:t>
-      </w:r>
-      <w:r>
-        <w:t xml:space="preserve">(EHR) data can predict a treatment-switch–defined EHR proxy for</w:t>
-      </w:r>
-      <w:r>
-        <w:t xml:space="preserve"> </w:t>
-      </w:r>
-      <w:r>
-        <w:t xml:space="preserve">treatment-resistant depression (TRD) at the point of a patient’s index</w:t>
-      </w:r>
-      <w:r>
-        <w:t xml:space="preserve"> </w:t>
-      </w:r>
-      <w:r>
-        <w:t xml:space="preserve">antidepressant prescription. It makes two points, and the manuscript is organized around them.</w:t>
+        <w:t xml:space="preserve">The study asks whether pretrained embeddings of rule-based patient</w:t>
+      </w:r>
+      <w:r>
+        <w:t xml:space="preserve"> </w:t>
+      </w:r>
+      <w:r>
+        <w:t xml:space="preserve">narratives predict a treatment-switching proxy for treatment-resistant</w:t>
+      </w:r>
+      <w:r>
+        <w:t xml:space="preserve"> </w:t>
+      </w:r>
+      <w:r>
+        <w:t xml:space="preserve">depression (TRD) better than structured feature vectors built from the same</w:t>
+      </w:r>
+      <w:r>
+        <w:t xml:space="preserve"> </w:t>
+      </w:r>
+      <w:r>
+        <w:t xml:space="preserve">electronic health records (EHRs). Prediction is made at the index</w:t>
+      </w:r>
+      <w:r>
+        <w:t xml:space="preserve"> </w:t>
+      </w:r>
+      <w:r>
+        <w:t xml:space="preserve">antidepressant prescription.</w:t>
       </w:r>
     </w:p>
     <w:p>
@@ -162,55 +148,49 @@
         <w:pStyle w:val="BodyText"/>
       </w:pPr>
       <w:r>
-        <w:t xml:space="preserve">The first is that writing the record out as text and embedding it with a</w:t>
-      </w:r>
-      <w:r>
-        <w:t xml:space="preserve"> </w:t>
-      </w:r>
-      <w:r>
-        <w:t xml:space="preserve">general-purpose transformer does not beat a transparent typed feature</w:t>
-      </w:r>
-      <w:r>
-        <w:t xml:space="preserve"> </w:t>
-      </w:r>
-      <w:r>
-        <w:t xml:space="preserve">vector built from the same record. In a cohort of 42,579 patients the</w:t>
-      </w:r>
-      <w:r>
-        <w:t xml:space="preserve"> </w:t>
-      </w:r>
-      <w:r>
-        <w:t xml:space="preserve">paired difference between the two best models is +0.008 ROC AUC (95% CI</w:t>
-      </w:r>
-      <w:r>
-        <w:t xml:space="preserve"> </w:t>
-      </w:r>
-      <w:r>
-        <w:t xml:space="preserve">−0.003 to +0.019), and the result holds across four encoders. The</w:t>
-      </w:r>
-      <w:r>
-        <w:t xml:space="preserve"> </w:t>
-      </w:r>
-      <w:r>
-        <w:t xml:space="preserve">comparison is nevertheless not a simple tie: the embedding significantly</w:t>
-      </w:r>
-      <w:r>
-        <w:t xml:space="preserve"> </w:t>
-      </w:r>
-      <w:r>
-        <w:t xml:space="preserve">helps logistic regression and significantly hurts all three tree</w:t>
-      </w:r>
-      <w:r>
-        <w:t xml:space="preserve"> </w:t>
-      </w:r>
-      <w:r>
-        <w:t xml:space="preserve">ensembles, so representation and learner are one design choice rather</w:t>
-      </w:r>
-      <w:r>
-        <w:t xml:space="preserve"> </w:t>
-      </w:r>
-      <w:r>
-        <w:t xml:space="preserve">than two.</w:t>
+        <w:t xml:space="preserve">In 42,579 patients from one community health system, the two approaches</w:t>
+      </w:r>
+      <w:r>
+        <w:t xml:space="preserve"> </w:t>
+      </w:r>
+      <w:r>
+        <w:t xml:space="preserve">performed similarly. Embedded logistic regression reached a receiver</w:t>
+      </w:r>
+      <w:r>
+        <w:t xml:space="preserve"> </w:t>
+      </w:r>
+      <w:r>
+        <w:t xml:space="preserve">operating characteristic area under the curve (ROC AUC) of 0.657 (95% CI</w:t>
+      </w:r>
+      <w:r>
+        <w:t xml:space="preserve"> </w:t>
+      </w:r>
+      <w:r>
+        <w:t xml:space="preserve">0.643-0.672). Feature-vector XGBoost reached 0.649 (95% CI 0.634-0.664).</w:t>
+      </w:r>
+      <w:r>
+        <w:t xml:space="preserve"> </w:t>
+      </w:r>
+      <w:r>
+        <w:t xml:space="preserve">Their paired difference was 0.008 (95% CI -0.003 to 0.019). The classifier</w:t>
+      </w:r>
+      <w:r>
+        <w:t xml:space="preserve"> </w:t>
+      </w:r>
+      <w:r>
+        <w:t xml:space="preserve">changed the result: embeddings improved logistic regression and reduced</w:t>
+      </w:r>
+      <w:r>
+        <w:t xml:space="preserve"> </w:t>
+      </w:r>
+      <w:r>
+        <w:t xml:space="preserve">discrimination for all three tree ensembles. Logistic regression led the</w:t>
+      </w:r>
+      <w:r>
+        <w:t xml:space="preserve"> </w:t>
+      </w:r>
+      <w:r>
+        <w:t xml:space="preserve">embedded models on all four encoders.</w:t>
       </w:r>
     </w:p>
     <w:p>
@@ -218,49 +198,43 @@
         <w:pStyle w:val="BodyText"/>
       </w:pPr>
       <w:r>
-        <w:t xml:space="preserve">The second is that predicting a patient from their nearest neighbors in</w:t>
-      </w:r>
-      <w:r>
-        <w:t xml:space="preserve"> </w:t>
-      </w:r>
-      <w:r>
-        <w:t xml:space="preserve">that embedding — the clinical digital-twin premise — recovers real</w:t>
-      </w:r>
-      <w:r>
-        <w:t xml:space="preserve"> </w:t>
-      </w:r>
-      <w:r>
-        <w:t xml:space="preserve">signal and still loses decisively to a model fitted on the same</w:t>
-      </w:r>
-      <w:r>
-        <w:t xml:space="preserve"> </w:t>
-      </w:r>
-      <w:r>
-        <w:t xml:space="preserve">representation. Nearest retrieval reaches 0.594 against 0.499 for random</w:t>
-      </w:r>
-      <w:r>
-        <w:t xml:space="preserve"> </w:t>
-      </w:r>
-      <w:r>
-        <w:t xml:space="preserve">retrieval and 0.432 for farthest retrieval, which establishes that</w:t>
-      </w:r>
-      <w:r>
-        <w:t xml:space="preserve"> </w:t>
-      </w:r>
-      <w:r>
-        <w:t xml:space="preserve">proximity in the embedding tracks TRD risk. It nevertheless falls 0.063</w:t>
-      </w:r>
-      <w:r>
-        <w:t xml:space="preserve"> </w:t>
-      </w:r>
-      <w:r>
-        <w:t xml:space="preserve">ROC AUC short of the trained classifier, on intervals that do not</w:t>
-      </w:r>
-      <w:r>
-        <w:t xml:space="preserve"> </w:t>
-      </w:r>
-      <w:r>
-        <w:t xml:space="preserve">overlap, and that shortfall reproduces on every encoder tested.</w:t>
+        <w:t xml:space="preserve">The predictive signal came from familiar clinical history. Permuting</w:t>
+      </w:r>
+      <w:r>
+        <w:t xml:space="preserve"> </w:t>
+      </w:r>
+      <w:r>
+        <w:t xml:space="preserve">psychiatric history caused the largest loss, and medication burden and</w:t>
+      </w:r>
+      <w:r>
+        <w:t xml:space="preserve"> </w:t>
+      </w:r>
+      <w:r>
+        <w:t xml:space="preserve">prior treatment also contributed. Permuting race/ethnicity or social</w:t>
+      </w:r>
+      <w:r>
+        <w:t xml:space="preserve"> </w:t>
+      </w:r>
+      <w:r>
+        <w:t xml:space="preserve">determinants changed ROC AUC by no more than 0.003. Nearest-neighbor</w:t>
+      </w:r>
+      <w:r>
+        <w:t xml:space="preserve"> </w:t>
+      </w:r>
+      <w:r>
+        <w:t xml:space="preserve">retrieval over the embedding showed that proximity tracks outcome risk, but</w:t>
+      </w:r>
+      <w:r>
+        <w:t xml:space="preserve"> </w:t>
+      </w:r>
+      <w:r>
+        <w:t xml:space="preserve">it stayed below both leading classifiers at every neighborhood size. Its</w:t>
+      </w:r>
+      <w:r>
+        <w:t xml:space="preserve"> </w:t>
+      </w:r>
+      <w:r>
+        <w:t xml:space="preserve">best ROC AUC was 0.625 (95% CI 0.610-0.641).</w:t>
       </w:r>
     </w:p>
     <w:p>
@@ -268,132 +242,37 @@
         <w:pStyle w:val="BodyText"/>
       </w:pPr>
       <w:r>
-        <w:t xml:space="preserve">One thing is true of both results and bounds both, and the manuscript stresses</w:t>
-      </w:r>
-      <w:r>
-        <w:t xml:space="preserve"> </w:t>
-      </w:r>
-      <w:r>
-        <w:t xml:space="preserve">it rather than leaving it to be inferred: in both arms the patient data were</w:t>
-      </w:r>
-      <w:r>
-        <w:t xml:space="preserve"> </w:t>
-      </w:r>
-      <w:r>
-        <w:t xml:space="preserve">hand-picked. Predictor selection ran once, before either representation</w:t>
-      </w:r>
-      <w:r>
-        <w:t xml:space="preserve"> </w:t>
-      </w:r>
-      <w:r>
-        <w:t xml:space="preserve">existed, and the narrative the encoder reads is a fixed template over that same</w:t>
-      </w:r>
-      <w:r>
-        <w:t xml:space="preserve"> </w:t>
-      </w:r>
-      <w:r>
-        <w:t xml:space="preserve">selection. Serialize-and-embed is often recommended as a way to stop choosing</w:t>
-      </w:r>
-      <w:r>
-        <w:t xml:space="preserve"> </w:t>
-      </w:r>
-      <w:r>
-        <w:t xml:space="preserve">features, and a reader arriving at a parity result with that expectation will</w:t>
-      </w:r>
-      <w:r>
-        <w:t xml:space="preserve"> </w:t>
-      </w:r>
-      <w:r>
-        <w:t xml:space="preserve">read it as</w:t>
-      </w:r>
-      <w:r>
-        <w:t xml:space="preserve"> </w:t>
-      </w:r>
-      <w:r>
-        <w:t xml:space="preserve">“</w:t>
-      </w:r>
-      <w:r>
-        <w:t xml:space="preserve">the embedder did as well with no feature engineering</w:t>
-      </w:r>
-      <w:r>
-        <w:t xml:space="preserve">”</w:t>
-      </w:r>
-      <w:r>
-        <w:t xml:space="preserve">. The</w:t>
-      </w:r>
-      <w:r>
-        <w:t xml:space="preserve"> </w:t>
-      </w:r>
-      <w:r>
-        <w:t xml:space="preserve">engineering was relocated, not removed, and a whole untailored record was never</w:t>
-      </w:r>
-      <w:r>
-        <w:t xml:space="preserve"> </w:t>
-      </w:r>
-      <w:r>
-        <w:t xml:space="preserve">embedded. Supplement S10 is the field-by-field evidence.</w:t>
-      </w:r>
-    </w:p>
-    <w:p>
-      <w:pPr>
-        <w:pStyle w:val="BodyText"/>
-      </w:pPr>
-      <w:r>
-        <w:t xml:space="preserve">Discrimination is modest throughout (ROC AUC ≈ 0.65)</w:t>
-      </w:r>
-      <w:r>
-        <w:t xml:space="preserve"> </w:t>
-      </w:r>
-      <w:r>
-        <w:t xml:space="preserve">and the predictive signal localizes to clinical content, psychiatric history</w:t>
-      </w:r>
-      <w:r>
-        <w:t xml:space="preserve"> </w:t>
-      </w:r>
-      <w:r>
-        <w:t xml:space="preserve">and medication burden, rather than to the sociodemographic fields supplied to</w:t>
-      </w:r>
-      <w:r>
-        <w:t xml:space="preserve"> </w:t>
-      </w:r>
-      <w:r>
-        <w:t xml:space="preserve">the models. Subgroup discrimination and calibration are reported across</w:t>
-      </w:r>
-      <w:r>
-        <w:t xml:space="preserve"> </w:t>
-      </w:r>
-      <w:r>
-        <w:t xml:space="preserve">eight strata with multiplicity control. We are explicit throughout that</w:t>
-      </w:r>
-      <w:r>
-        <w:t xml:space="preserve"> </w:t>
-      </w:r>
-      <w:r>
-        <w:t xml:space="preserve">the target is a treatment-switch proxy rather than measured</w:t>
-      </w:r>
-      <w:r>
-        <w:t xml:space="preserve"> </w:t>
-      </w:r>
-      <w:r>
-        <w:t xml:space="preserve">non-response, that the study is an internal validation by a single</w:t>
-      </w:r>
-      <w:r>
-        <w:t xml:space="preserve"> </w:t>
-      </w:r>
-      <w:r>
-        <w:t xml:space="preserve">random split, and that it reports no fairness assessment. A Limitations</w:t>
-      </w:r>
-      <w:r>
-        <w:t xml:space="preserve"> </w:t>
-      </w:r>
-      <w:r>
-        <w:t xml:space="preserve">section states these and seven others in order of how much they bound</w:t>
-      </w:r>
-      <w:r>
-        <w:t xml:space="preserve"> </w:t>
-      </w:r>
-      <w:r>
-        <w:t xml:space="preserve">the conclusions.</w:t>
+        <w:t xml:space="preserve">We are explicit that the outcome is a treatment-switching proxy rather than</w:t>
+      </w:r>
+      <w:r>
+        <w:t xml:space="preserve"> </w:t>
+      </w:r>
+      <w:r>
+        <w:t xml:space="preserve">confirmed treatment resistance, that validation is internal, and that the</w:t>
+      </w:r>
+      <w:r>
+        <w:t xml:space="preserve"> </w:t>
+      </w:r>
+      <w:r>
+        <w:t xml:space="preserve">subgroup analyses do not establish equitable performance. We think the</w:t>
+      </w:r>
+      <w:r>
+        <w:t xml:space="preserve"> </w:t>
+      </w:r>
+      <w:r>
+        <w:t xml:space="preserve">results give a practical structured-feature benchmark for EHR embedding</w:t>
+      </w:r>
+      <w:r>
+        <w:t xml:space="preserve"> </w:t>
+      </w:r>
+      <w:r>
+        <w:t xml:space="preserve">pipelines, and a clear case for validating the outcome before deploying</w:t>
+      </w:r>
+      <w:r>
+        <w:t xml:space="preserve"> </w:t>
+      </w:r>
+      <w:r>
+        <w:t xml:space="preserve">either approach.</w:t>
       </w:r>
     </w:p>
     <w:p>

</xml_diff>

<commit_message>
the manuscript states the hand-selected-predictor scope condition in its limitations, the unequal-access reason in Outcome, and that no class-imbalance method was used; the checklist and cover letter point at them
</commit_message>
<xml_diff>
--- a/research/TRD-EHR/paper1-trd-prediction/cover_letter.docx
+++ b/research/TRD-EHR/paper1-trd-prediction/cover_letter.docx
@@ -254,7 +254,19 @@
         <w:t xml:space="preserve"> </w:t>
       </w:r>
       <w:r>
-        <w:t xml:space="preserve">subgroup analyses do not establish equitable performance. We think the</w:t>
+        <w:t xml:space="preserve">subgroup analyses do not establish equitable performance. Both</w:t>
+      </w:r>
+      <w:r>
+        <w:t xml:space="preserve"> </w:t>
+      </w:r>
+      <w:r>
+        <w:t xml:space="preserve">representations encode the same hand-selected predictors, so the comparison</w:t>
+      </w:r>
+      <w:r>
+        <w:t xml:space="preserve"> </w:t>
+      </w:r>
+      <w:r>
+        <w:t xml:space="preserve">says nothing about embedding an unselected record. We think the</w:t>
       </w:r>
       <w:r>
         <w:t xml:space="preserve"> </w:t>

</xml_diff>

<commit_message>
trd-ehr: answer the 2026-09-29 ink round; every retrieval result at best k
Sixteen ink marks on manuscript pages 1-7, answered item by item in
review/round_2026-09-29.md: plain rewrites of the sampling, index,
outcome, access, trial-length, tuning, bootstrap and comparison passages,
two sentences cut, and author contributions corrected. Figure 1 counts
same-day prescribing in patients, 25,645 of 42,579 (60.2%).

Retrieval: abstract, results, discussion, cover letter and TRIPOD quote
each arm at its test-selected best k against the random floor. Supplement
S2-S3 gain the three arms' PR and calibration panels; Table S7 drops its
k = 50 rows; Table S8 and the S9 subgroups are re-scored at best k (23 of
240 contrasts survive BH). Parts re-split; packet rebuilt.
</commit_message>
<xml_diff>
--- a/research/TRD-EHR/paper1-trd-prediction/cover_letter.docx
+++ b/research/TRD-EHR/paper1-trd-prediction/cover_letter.docx
@@ -234,7 +234,13 @@
         <w:t xml:space="preserve"> </w:t>
       </w:r>
       <w:r>
-        <w:t xml:space="preserve">best ROC AUC was 0.625 (95% CI 0.610-0.641).</w:t>
+        <w:t xml:space="preserve">best ROC AUC was 0.625 (95% CI 0.610-0.641), at a neighborhood size chosen on</w:t>
+      </w:r>
+      <w:r>
+        <w:t xml:space="preserve"> </w:t>
+      </w:r>
+      <w:r>
+        <w:t xml:space="preserve">the test patients, against 0.500 (0.484-0.515) for randomly chosen neighbors.</w:t>
       </w:r>
     </w:p>
     <w:p>

</xml_diff>

<commit_message>
paper1: TRIPOD table columns sized to their text; Figure S15 fits the page; cover letter and TRIPOD rebuilt
- tripod_ai_checklist.md: the seven tables' separator rows give Item and D/E
  about 9% each, the checklist item 33% and "Reported in" 49%, instead of
  25% apiece. The PDF goes from 46 pages of four-word lines to 21.
- supplement.md: Figure S15 (ablation_roc_ci_EMBEDDED.png) at 6in, not 6.6in,
  so --strict passes; parts/supplement/26 re-split to match.
- cover_letter and tripod_ai_checklist .docx and .pdf rebuilt from the
  2026-10-05 sources (no figures in either).
- manuscript and supplement .docx/.pdf are NOT rebuilt: the Mac has no
  results/ and no exports/ yet, and a build here would drop every figure.
</commit_message>
<xml_diff>
--- a/research/TRD-EHR/paper1-trd-prediction/cover_letter.docx
+++ b/research/TRD-EHR/paper1-trd-prediction/cover_letter.docx
@@ -44,66 +44,52 @@
       </w:r>
       <w:r>
         <w:rPr>
+          <w:b/>
           <w:bCs/>
+        </w:rPr>
+        <w:t xml:space="preserve">“Feature Vectors and Narrative Embeddings for Predicting a Treatment</w:t>
+      </w:r>
+      <w:r>
+        <w:rPr>
           <w:b/>
+          <w:bCs/>
         </w:rPr>
-        <w:t xml:space="preserve">“</w:t>
+        <w:t xml:space="preserve"> </w:t>
       </w:r>
       <w:r>
         <w:rPr>
+          <w:b/>
           <w:bCs/>
-          <w:b/>
-        </w:rPr>
-        <w:t xml:space="preserve">Feature Vectors and Narrative Embeddings for Predicting a Treatment</w:t>
-      </w:r>
-      <w:r>
-        <w:rPr>
-          <w:bCs/>
-          <w:b/>
-        </w:rPr>
-        <w:t xml:space="preserve"> </w:t>
-      </w:r>
-      <w:r>
-        <w:rPr>
-          <w:bCs/>
-          <w:b/>
         </w:rPr>
         <w:t xml:space="preserve">Switching Proxy for Treatment Resistant Depression: Retrospective Cohort</w:t>
       </w:r>
       <w:r>
         <w:rPr>
+          <w:b/>
           <w:bCs/>
+        </w:rPr>
+        <w:t xml:space="preserve"> </w:t>
+      </w:r>
+      <w:r>
+        <w:rPr>
           <w:b/>
+          <w:bCs/>
         </w:rPr>
+        <w:t xml:space="preserve">Study,”</w:t>
+      </w:r>
+      <w:r>
+        <w:t xml:space="preserve"> </w:t>
+      </w:r>
+      <w:r>
+        <w:t xml:space="preserve">for consideration in</w:t>
+      </w:r>
+      <w:r>
         <w:t xml:space="preserve"> </w:t>
       </w:r>
       <w:r>
         <w:rPr>
-          <w:bCs/>
-          <w:b/>
-        </w:rPr>
-        <w:t xml:space="preserve">Study,</w:t>
-      </w:r>
-      <w:r>
-        <w:rPr>
-          <w:bCs/>
-          <w:b/>
-        </w:rPr>
-        <w:t xml:space="preserve">”</w:t>
-      </w:r>
-      <w:r>
-        <w:t xml:space="preserve"> </w:t>
-      </w:r>
-      <w:r>
-        <w:t xml:space="preserve">for consideration in</w:t>
-      </w:r>
-      <w:r>
-        <w:t xml:space="preserve"> </w:t>
-      </w:r>
-      <w:r>
-        <w:rPr>
+          <w:i/>
           <w:iCs/>
-          <w:i/>
         </w:rPr>
         <w:t xml:space="preserve">JMIR Mental Health</w:t>
       </w:r>
@@ -234,25 +220,37 @@
         <w:t xml:space="preserve"> </w:t>
       </w:r>
       <w:r>
-        <w:t xml:space="preserve">at every neighborhood size. Logistic-regression-weighted retrieval reached 0.625 (95%</w:t>
-      </w:r>
-      <w:r>
-        <w:t xml:space="preserve"> </w:t>
-      </w:r>
-      <w:r>
-        <w:t xml:space="preserve">CI 0.610-0.641) at 295 neighbors, a size chosen on the test patients.</w:t>
-      </w:r>
-      <w:r>
-        <w:t xml:space="preserve"> </w:t>
-      </w:r>
-      <w:r>
-        <w:t xml:space="preserve">Randomly chosen neighbors reached 0.500 (2.5th-97.5th percentile across</w:t>
-      </w:r>
-      <w:r>
-        <w:t xml:space="preserve"> </w:t>
-      </w:r>
-      <w:r>
-        <w:t xml:space="preserve">1,000 draws 0.484-0.515).</w:t>
+        <w:t xml:space="preserve">at every neighborhood size from 1 to 34,063, for all four encoders. Its</w:t>
+      </w:r>
+      <w:r>
+        <w:t xml:space="preserve"> </w:t>
+      </w:r>
+      <w:r>
+        <w:t xml:space="preserve">maximum for the primary encoder at similarity exponent 1, 0.625 (95% CI</w:t>
+      </w:r>
+      <w:r>
+        <w:t xml:space="preserve"> </w:t>
+      </w:r>
+      <w:r>
+        <w:t xml:space="preserve">0.610-0.641), was read at a</w:t>
+      </w:r>
+      <w:r>
+        <w:t xml:space="preserve"> </w:t>
+      </w:r>
+      <w:r>
+        <w:t xml:space="preserve">size chosen on the test patients. Randomly chosen neighbors stayed at</w:t>
+      </w:r>
+      <w:r>
+        <w:t xml:space="preserve"> </w:t>
+      </w:r>
+      <w:r>
+        <w:t xml:space="preserve">chance, at most 0.500 (2.5th-97.5th percentile across 1,000 draws</w:t>
+      </w:r>
+      <w:r>
+        <w:t xml:space="preserve"> </w:t>
+      </w:r>
+      <w:r>
+        <w:t xml:space="preserve">0.484-0.515).</w:t>
       </w:r>
     </w:p>
     <w:p>
@@ -317,8 +315,8 @@
       </w:r>
       <w:r>
         <w:rPr>
+          <w:b/>
           <w:bCs/>
-          <w:b/>
         </w:rPr>
         <w:t xml:space="preserve">TRIPOD+AI</w:t>
       </w:r>
@@ -686,14 +684,14 @@
     </w:lvl>
   </w:abstractNum>
   <w:abstractNum w:abstractNumId="990">
-    <w:nsid w:val="2c1ae401"/>
+    <w:nsid w:val="0000A990"/>
     <w:multiLevelType w:val="multilevel"/>
     <w:lvl w:ilvl="0">
       <w:numFmt w:val="bullet"/>
       <w:lvlText w:val=" "/>
       <w:lvlJc w:val="left"/>
       <w:pPr>
-        <w:ind w:left="720" w:hanging="480"/>
+        <w:ind w:left="720" w:hanging="360"/>
       </w:pPr>
     </w:lvl>
     <w:lvl w:ilvl="1">
@@ -701,7 +699,7 @@
       <w:lvlText w:val=" "/>
       <w:lvlJc w:val="left"/>
       <w:pPr>
-        <w:ind w:left="1440" w:hanging="480"/>
+        <w:ind w:left="1440" w:hanging="360"/>
       </w:pPr>
     </w:lvl>
     <w:lvl w:ilvl="2">
@@ -709,7 +707,7 @@
       <w:lvlText w:val=" "/>
       <w:lvlJc w:val="left"/>
       <w:pPr>
-        <w:ind w:left="2160" w:hanging="480"/>
+        <w:ind w:left="2160" w:hanging="360"/>
       </w:pPr>
     </w:lvl>
     <w:lvl w:ilvl="3">
@@ -717,7 +715,7 @@
       <w:lvlText w:val=" "/>
       <w:lvlJc w:val="left"/>
       <w:pPr>
-        <w:ind w:left="2880" w:hanging="480"/>
+        <w:ind w:left="2880" w:hanging="360"/>
       </w:pPr>
     </w:lvl>
     <w:lvl w:ilvl="4">
@@ -725,7 +723,7 @@
       <w:lvlText w:val=" "/>
       <w:lvlJc w:val="left"/>
       <w:pPr>
-        <w:ind w:left="3600" w:hanging="480"/>
+        <w:ind w:left="3600" w:hanging="360"/>
       </w:pPr>
     </w:lvl>
     <w:lvl w:ilvl="5">
@@ -733,7 +731,7 @@
       <w:lvlText w:val=" "/>
       <w:lvlJc w:val="left"/>
       <w:pPr>
-        <w:ind w:left="4320" w:hanging="480"/>
+        <w:ind w:left="4320" w:hanging="360"/>
       </w:pPr>
     </w:lvl>
     <w:lvl w:ilvl="6">
@@ -741,7 +739,7 @@
       <w:lvlText w:val=" "/>
       <w:lvlJc w:val="left"/>
       <w:pPr>
-        <w:ind w:left="5040" w:hanging="480"/>
+        <w:ind w:left="5040" w:hanging="360"/>
       </w:pPr>
     </w:lvl>
     <w:lvl w:ilvl="7">
@@ -749,7 +747,7 @@
       <w:lvlText w:val=" "/>
       <w:lvlJc w:val="left"/>
       <w:pPr>
-        <w:ind w:left="5760" w:hanging="480"/>
+        <w:ind w:left="5760" w:hanging="360"/>
       </w:pPr>
     </w:lvl>
     <w:lvl w:ilvl="8">
@@ -757,7 +755,7 @@
       <w:lvlText w:val=" "/>
       <w:lvlJc w:val="left"/>
       <w:pPr>
-        <w:ind w:left="6480" w:hanging="480"/>
+        <w:ind w:left="6480" w:hanging="360"/>
       </w:pPr>
     </w:lvl>
   </w:abstractNum>
@@ -1508,8 +1506,8 @@
     <w:name w:val="KeywordTok"/>
     <w:basedOn w:val="VerbatimChar"/>
     <w:rPr>
+      <w:b/>
       <w:color w:val="007020"/>
-      <w:b/>
     </w:rPr>
   </w:style>
   <w:style w:type="character" w:customStyle="1" w:styleId="DataTypeTok">
@@ -1585,40 +1583,43 @@
   <w:style w:type="character" w:customStyle="1" w:styleId="ImportTok">
     <w:name w:val="ImportTok"/>
     <w:basedOn w:val="VerbatimChar"/>
-    <w:rPr/>
+    <w:rPr>
+      <w:b/>
+      <w:color w:val="008000"/>
+    </w:rPr>
   </w:style>
   <w:style w:type="character" w:customStyle="1" w:styleId="CommentTok">
     <w:name w:val="CommentTok"/>
     <w:basedOn w:val="VerbatimChar"/>
     <w:rPr>
+      <w:i/>
       <w:color w:val="60a0b0"/>
-      <w:i/>
     </w:rPr>
   </w:style>
   <w:style w:type="character" w:customStyle="1" w:styleId="DocumentationTok">
     <w:name w:val="DocumentationTok"/>
     <w:basedOn w:val="VerbatimChar"/>
     <w:rPr>
+      <w:i/>
       <w:color w:val="ba2121"/>
-      <w:i/>
     </w:rPr>
   </w:style>
   <w:style w:type="character" w:customStyle="1" w:styleId="AnnotationTok">
     <w:name w:val="AnnotationTok"/>
     <w:basedOn w:val="VerbatimChar"/>
     <w:rPr>
-      <w:color w:val="60a0b0"/>
       <w:b/>
       <w:i/>
+      <w:color w:val="60a0b0"/>
     </w:rPr>
   </w:style>
   <w:style w:type="character" w:customStyle="1" w:styleId="CommentVarTok">
     <w:name w:val="CommentVarTok"/>
     <w:basedOn w:val="VerbatimChar"/>
     <w:rPr>
-      <w:color w:val="60a0b0"/>
       <w:b/>
       <w:i/>
+      <w:color w:val="60a0b0"/>
     </w:rPr>
   </w:style>
   <w:style w:type="character" w:customStyle="1" w:styleId="OtherTok">
@@ -1646,8 +1647,8 @@
     <w:name w:val="ControlFlowTok"/>
     <w:basedOn w:val="VerbatimChar"/>
     <w:rPr>
+      <w:b/>
       <w:color w:val="007020"/>
-      <w:b/>
     </w:rPr>
   </w:style>
   <w:style w:type="character" w:customStyle="1" w:styleId="OperatorTok">
@@ -1660,7 +1661,9 @@
   <w:style w:type="character" w:customStyle="1" w:styleId="BuiltInTok">
     <w:name w:val="BuiltInTok"/>
     <w:basedOn w:val="VerbatimChar"/>
-    <w:rPr/>
+    <w:rPr>
+      <w:color w:val="008000"/>
+    </w:rPr>
   </w:style>
   <w:style w:type="character" w:customStyle="1" w:styleId="ExtensionTok">
     <w:name w:val="ExtensionTok"/>
@@ -1690,34 +1693,34 @@
     <w:name w:val="InformationTok"/>
     <w:basedOn w:val="VerbatimChar"/>
     <w:rPr>
-      <w:color w:val="60a0b0"/>
       <w:b/>
       <w:i/>
+      <w:color w:val="60a0b0"/>
     </w:rPr>
   </w:style>
   <w:style w:type="character" w:customStyle="1" w:styleId="WarningTok">
     <w:name w:val="WarningTok"/>
     <w:basedOn w:val="VerbatimChar"/>
     <w:rPr>
-      <w:color w:val="60a0b0"/>
       <w:b/>
       <w:i/>
+      <w:color w:val="60a0b0"/>
     </w:rPr>
   </w:style>
   <w:style w:type="character" w:customStyle="1" w:styleId="AlertTok">
     <w:name w:val="AlertTok"/>
     <w:basedOn w:val="VerbatimChar"/>
     <w:rPr>
+      <w:b/>
       <w:color w:val="ff0000"/>
-      <w:b/>
     </w:rPr>
   </w:style>
   <w:style w:type="character" w:customStyle="1" w:styleId="ErrorTok">
     <w:name w:val="ErrorTok"/>
     <w:basedOn w:val="VerbatimChar"/>
     <w:rPr>
+      <w:b/>
       <w:color w:val="ff0000"/>
-      <w:b/>
     </w:rPr>
   </w:style>
   <w:style w:type="character" w:customStyle="1" w:styleId="NormalTok">

</xml_diff>